<commit_message>
feat: refresh resume content (trader + Odds Aggregator, skills, URL)
set_paragraph_text now removes all <w:r> AND <w:hyperlink> children
before re-attaching the first run with new text. The original
contact line contained hyperlinks for the email and LinkedIn — the
naive p.runs iteration missed them and left residual text appended
after the new content. The trade-off: the email and LinkedIn become
plain text in the rendered PDF (lose their click-to-mail / click-
through behaviour); reinstating those as proper hyperlinks would be
a separate polish.
</commit_message>
<xml_diff>
--- a/resume-source.docx
+++ b/resume-source.docx
@@ -159,160 +159,7 @@
           <w:sz w:val="23"/>
           <w:szCs w:val="23"/>
         </w:rPr>
-        <w:t>Proficient in</w:t>
-      </w:r>
-      <w:r>
-        <w:rPr>
-          <w:rFonts w:ascii="Garamond" w:eastAsia="Garamond" w:hAnsi="Garamond" w:cs="Garamond"/>
-          <w:color w:val="000000"/>
-          <w:sz w:val="23"/>
-          <w:szCs w:val="23"/>
-        </w:rPr>
-        <w:t xml:space="preserve"> Python, </w:t>
-      </w:r>
-      <w:r>
-        <w:rPr>
-          <w:rFonts w:ascii="Garamond" w:eastAsia="Garamond" w:hAnsi="Garamond" w:cs="Garamond"/>
-          <w:color w:val="000000"/>
-          <w:sz w:val="23"/>
-          <w:szCs w:val="23"/>
-        </w:rPr>
-        <w:t xml:space="preserve">Java, C, </w:t>
-      </w:r>
-      <w:r>
-        <w:rPr>
-          <w:rFonts w:ascii="Garamond" w:eastAsia="Garamond" w:hAnsi="Garamond" w:cs="Garamond"/>
-          <w:color w:val="000000"/>
-          <w:sz w:val="23"/>
-          <w:szCs w:val="23"/>
-        </w:rPr>
-        <w:t xml:space="preserve">C#, </w:t>
-      </w:r>
-      <w:r>
-        <w:rPr>
-          <w:rFonts w:ascii="Garamond" w:eastAsia="Garamond" w:hAnsi="Garamond" w:cs="Garamond"/>
-          <w:color w:val="000000"/>
-          <w:sz w:val="23"/>
-          <w:szCs w:val="23"/>
-        </w:rPr>
-        <w:t>C++,</w:t>
-      </w:r>
-      <w:r>
-        <w:rPr>
-          <w:rFonts w:ascii="Garamond" w:eastAsia="Garamond" w:hAnsi="Garamond" w:cs="Garamond"/>
-          <w:color w:val="000000"/>
-          <w:sz w:val="23"/>
-          <w:szCs w:val="23"/>
-        </w:rPr>
-        <w:t xml:space="preserve"> </w:t>
-      </w:r>
-      <w:r>
-        <w:rPr>
-          <w:rFonts w:ascii="Garamond" w:eastAsia="Garamond" w:hAnsi="Garamond" w:cs="Garamond"/>
-          <w:color w:val="000000"/>
-          <w:sz w:val="23"/>
-          <w:szCs w:val="23"/>
-        </w:rPr>
-        <w:t xml:space="preserve">SQL, </w:t>
-      </w:r>
-      <w:r>
-        <w:rPr>
-          <w:rFonts w:ascii="Garamond" w:eastAsia="Garamond" w:hAnsi="Garamond" w:cs="Garamond"/>
-          <w:color w:val="000000"/>
-          <w:sz w:val="23"/>
-          <w:szCs w:val="23"/>
-        </w:rPr>
-        <w:t>Git</w:t>
-      </w:r>
-      <w:r>
-        <w:rPr>
-          <w:rFonts w:ascii="Garamond" w:eastAsia="Garamond" w:hAnsi="Garamond" w:cs="Garamond"/>
-          <w:color w:val="000000"/>
-          <w:sz w:val="23"/>
-          <w:szCs w:val="23"/>
-        </w:rPr>
-        <w:t>,</w:t>
-      </w:r>
-      <w:r>
-        <w:rPr>
-          <w:rFonts w:ascii="Garamond" w:eastAsia="Garamond" w:hAnsi="Garamond" w:cs="Garamond"/>
-          <w:color w:val="000000"/>
-          <w:sz w:val="23"/>
-          <w:szCs w:val="23"/>
-        </w:rPr>
-        <w:t xml:space="preserve"> Word</w:t>
-      </w:r>
-      <w:r>
-        <w:rPr>
-          <w:rFonts w:ascii="Garamond" w:eastAsia="Garamond" w:hAnsi="Garamond" w:cs="Garamond"/>
-          <w:color w:val="000000"/>
-          <w:sz w:val="23"/>
-          <w:szCs w:val="23"/>
-        </w:rPr>
-        <w:t xml:space="preserve">, </w:t>
-      </w:r>
-      <w:r>
-        <w:rPr>
-          <w:rFonts w:ascii="Garamond" w:eastAsia="Garamond" w:hAnsi="Garamond" w:cs="Garamond"/>
-          <w:color w:val="000000"/>
-          <w:sz w:val="23"/>
-          <w:szCs w:val="23"/>
-        </w:rPr>
-        <w:t>Excel</w:t>
-      </w:r>
-      <w:r>
-        <w:rPr>
-          <w:rFonts w:ascii="Garamond" w:eastAsia="Garamond" w:hAnsi="Garamond" w:cs="Garamond"/>
-          <w:color w:val="000000"/>
-          <w:sz w:val="23"/>
-          <w:szCs w:val="23"/>
-        </w:rPr>
-        <w:t>, JavaScript,</w:t>
-      </w:r>
-      <w:r>
-        <w:rPr>
-          <w:rFonts w:ascii="Garamond" w:eastAsia="Garamond" w:hAnsi="Garamond" w:cs="Garamond"/>
-          <w:color w:val="000000"/>
-          <w:sz w:val="23"/>
-          <w:szCs w:val="23"/>
-        </w:rPr>
-        <w:t xml:space="preserve"> Dart</w:t>
-      </w:r>
-      <w:r>
-        <w:rPr>
-          <w:rFonts w:ascii="Garamond" w:eastAsia="Garamond" w:hAnsi="Garamond" w:cs="Garamond"/>
-          <w:color w:val="000000"/>
-          <w:sz w:val="23"/>
-          <w:szCs w:val="23"/>
-        </w:rPr>
-        <w:t>, Unity,</w:t>
-      </w:r>
-      <w:r>
-        <w:rPr>
-          <w:rFonts w:ascii="Garamond" w:eastAsia="Garamond" w:hAnsi="Garamond" w:cs="Garamond"/>
-          <w:color w:val="000000"/>
-          <w:sz w:val="23"/>
-          <w:szCs w:val="23"/>
-        </w:rPr>
-        <w:t xml:space="preserve"> and</w:t>
-      </w:r>
-      <w:r>
-        <w:rPr>
-          <w:rFonts w:ascii="Garamond" w:eastAsia="Garamond" w:hAnsi="Garamond" w:cs="Garamond"/>
-          <w:color w:val="000000"/>
-          <w:sz w:val="23"/>
-          <w:szCs w:val="23"/>
-        </w:rPr>
-        <w:t xml:space="preserve"> Monday.com</w:t>
-      </w:r>
-      <w:r>
-        <w:rPr>
-          <w:rFonts w:ascii="Garamond" w:eastAsia="Garamond" w:hAnsi="Garamond" w:cs="Garamond"/>
-          <w:color w:val="000000"/>
-          <w:sz w:val="23"/>
-          <w:szCs w:val="23"/>
-        </w:rPr>
-        <w:t>.</w:t>
+        <w:t xml:space="preserve">Proficient in Python, Java, C, C#, C++, SQL, Git, Word, Excel, JavaScript, Dart, Unity, FastAPI, Playwright, Monday.com, and Google Apps Script.</w:t>
       </w:r>
     </w:p>
     <w:p>
@@ -2128,6 +1975,298 @@
           <w:szCs w:val="23"/>
         </w:rPr>
         <w:t xml:space="preserve"> </w:t>
+      </w:r>
+    </w:p>
+    <w:p>
+      <w:pPr>
+        <w:pBdr>
+          <w:top w:val="nil"/>
+          <w:left w:val="nil"/>
+          <w:bottom w:val="nil"/>
+          <w:right w:val="nil"/>
+          <w:between w:val="nil"/>
+        </w:pBdr>
+        <w:spacing w:after="0" w:line="240" w:lineRule="auto"/>
+        <w:jc w:val="center"/>
+        <w:rPr>
+          <w:rFonts w:ascii="Garamond" w:eastAsia="Garamond" w:hAnsi="Garamond" w:cs="Garamond"/>
+          <w:b/>
+          <w:color w:val="000000"/>
+        </w:rPr>
+      </w:pPr>
+      <w:r>
+        <w:rPr>
+          <w:rFonts w:ascii="Garamond" w:eastAsia="Garamond" w:hAnsi="Garamond" w:cs="Garamond"/>
+          <w:b/>
+          <w:color w:val="000000"/>
+        </w:rPr>
+        <w:t xml:space="preserve">PERSONAL PROJECTS</w:t>
+      </w:r>
+    </w:p>
+    <w:p>
+      <w:pPr>
+        <w:pBdr>
+          <w:top w:val="nil"/>
+          <w:left w:val="nil"/>
+          <w:bottom w:val="nil"/>
+          <w:right w:val="nil"/>
+          <w:between w:val="nil"/>
+        </w:pBdr>
+        <w:spacing w:after="0" w:line="240" w:lineRule="auto"/>
+        <w:rPr>
+          <w:rFonts w:ascii="Garamond" w:eastAsia="Garamond" w:hAnsi="Garamond" w:cs="Garamond"/>
+          <w:color w:val="000000"/>
+        </w:rPr>
+      </w:pPr>
+      <w:r>
+        <w:rPr>
+          <w:rFonts w:ascii="Garamond" w:eastAsia="Garamond" w:hAnsi="Garamond" w:cs="Garamond"/>
+          <w:b/>
+          <w:color w:val="000000"/>
+        </w:rPr>
+        <w:t xml:space="preserve">trader (Python · IBKR · Finnhub · pytest)</w:t>
+      </w:r>
+    </w:p>
+    <w:p>
+      <w:pPr>
+        <w:spacing w:after="0"/>
+        <w:rPr>
+          <w:rFonts w:ascii="Garamond" w:eastAsia="Garamond" w:hAnsi="Garamond" w:cs="Garamond"/>
+          <w:i/>
+        </w:rPr>
+      </w:pPr>
+      <w:r>
+        <w:rPr>
+          <w:rFonts w:ascii="Garamond" w:eastAsia="Garamond" w:hAnsi="Garamond" w:cs="Garamond"/>
+          <w:i/>
+        </w:rPr>
+        <w:t xml:space="preserve">AI swing-trading agent</w:t>
+      </w:r>
+    </w:p>
+    <w:p>
+      <w:pPr>
+        <w:numPr>
+          <w:ilvl w:val="0"/>
+          <w:numId w:val="2"/>
+        </w:numPr>
+        <w:pBdr>
+          <w:top w:val="nil"/>
+          <w:left w:val="nil"/>
+          <w:bottom w:val="nil"/>
+          <w:right w:val="nil"/>
+          <w:between w:val="nil"/>
+        </w:pBdr>
+        <w:spacing w:after="0" w:line="240" w:lineRule="auto"/>
+        <w:rPr>
+          <w:rFonts w:ascii="Garamond" w:eastAsia="Garamond" w:hAnsi="Garamond" w:cs="Garamond"/>
+          <w:color w:val="000000"/>
+          <w:sz w:val="23"/>
+          <w:szCs w:val="23"/>
+        </w:rPr>
+      </w:pPr>
+      <w:r>
+        <w:rPr>
+          <w:rFonts w:ascii="Garamond" w:eastAsia="Garamond" w:hAnsi="Garamond" w:cs="Garamond"/>
+          <w:color w:val="000000"/>
+          <w:sz w:val="23"/>
+          <w:szCs w:val="23"/>
+        </w:rPr>
+        <w:t xml:space="preserve">24/7 AI swing-trading agent for S&amp;P 500 equities, driven by six scheduled Claude Code routines.</w:t>
+      </w:r>
+    </w:p>
+    <w:p>
+      <w:pPr>
+        <w:numPr>
+          <w:ilvl w:val="0"/>
+          <w:numId w:val="2"/>
+        </w:numPr>
+        <w:pBdr>
+          <w:top w:val="nil"/>
+          <w:left w:val="nil"/>
+          <w:bottom w:val="nil"/>
+          <w:right w:val="nil"/>
+          <w:between w:val="nil"/>
+        </w:pBdr>
+        <w:spacing w:after="0" w:line="240" w:lineRule="auto"/>
+        <w:rPr>
+          <w:rFonts w:ascii="Garamond" w:eastAsia="Garamond" w:hAnsi="Garamond" w:cs="Garamond"/>
+          <w:color w:val="000000"/>
+          <w:sz w:val="23"/>
+          <w:szCs w:val="23"/>
+        </w:rPr>
+      </w:pPr>
+      <w:r>
+        <w:rPr>
+          <w:rFonts w:ascii="Garamond" w:eastAsia="Garamond" w:hAnsi="Garamond" w:cs="Garamond"/>
+          <w:color w:val="000000"/>
+          <w:sz w:val="23"/>
+          <w:szCs w:val="23"/>
+        </w:rPr>
+        <w:t xml:space="preserve">Paper-traded against SPY with kill-switch, risk gates, and committed JSON journaling; graduates to live trading after 30 days of documented outperformance.</w:t>
+      </w:r>
+    </w:p>
+    <w:p>
+      <w:pPr>
+        <w:numPr>
+          <w:ilvl w:val="0"/>
+          <w:numId w:val="2"/>
+        </w:numPr>
+        <w:pBdr>
+          <w:top w:val="nil"/>
+          <w:left w:val="nil"/>
+          <w:bottom w:val="nil"/>
+          <w:right w:val="nil"/>
+          <w:between w:val="nil"/>
+        </w:pBdr>
+        <w:spacing w:after="0" w:line="240" w:lineRule="auto"/>
+        <w:rPr>
+          <w:rFonts w:ascii="Garamond" w:eastAsia="Garamond" w:hAnsi="Garamond" w:cs="Garamond"/>
+          <w:color w:val="000000"/>
+          <w:sz w:val="23"/>
+          <w:szCs w:val="23"/>
+        </w:rPr>
+      </w:pPr>
+      <w:r>
+        <w:rPr>
+          <w:rFonts w:ascii="Garamond" w:eastAsia="Garamond" w:hAnsi="Garamond" w:cs="Garamond"/>
+          <w:color w:val="000000"/>
+          <w:sz w:val="23"/>
+          <w:szCs w:val="23"/>
+        </w:rPr>
+        <w:t xml:space="preserve">Designed broker abstraction so the live cutover is a one-line config change (IBKR active, Alpaca preserved).</w:t>
+      </w:r>
+    </w:p>
+    <w:p>
+      <w:pPr>
+        <w:pBdr>
+          <w:top w:val="nil"/>
+          <w:left w:val="nil"/>
+          <w:bottom w:val="nil"/>
+          <w:right w:val="nil"/>
+          <w:between w:val="nil"/>
+        </w:pBdr>
+        <w:spacing w:after="0" w:line="240" w:lineRule="auto"/>
+        <w:rPr>
+          <w:rFonts w:ascii="Garamond" w:eastAsia="Garamond" w:hAnsi="Garamond" w:cs="Garamond"/>
+          <w:color w:val="000000"/>
+        </w:rPr>
+      </w:pPr>
+      <w:r>
+        <w:rPr>
+          <w:rFonts w:ascii="Garamond" w:eastAsia="Garamond" w:hAnsi="Garamond" w:cs="Garamond"/>
+          <w:b/>
+          <w:color w:val="000000"/>
+        </w:rPr>
+        <w:t xml:space="preserve">Odds Aggregator (Python · Playwright · SQLite/Alembic · FastAPI)</w:t>
+      </w:r>
+    </w:p>
+    <w:p>
+      <w:pPr>
+        <w:spacing w:after="0"/>
+        <w:rPr>
+          <w:rFonts w:ascii="Garamond" w:eastAsia="Garamond" w:hAnsi="Garamond" w:cs="Garamond"/>
+          <w:i/>
+        </w:rPr>
+      </w:pPr>
+      <w:r>
+        <w:rPr>
+          <w:rFonts w:ascii="Garamond" w:eastAsia="Garamond" w:hAnsi="Garamond" w:cs="Garamond"/>
+          <w:i/>
+        </w:rPr>
+        <w:t xml:space="preserve">Production cross-book arbitrage daemon</w:t>
+      </w:r>
+    </w:p>
+    <w:p>
+      <w:pPr>
+        <w:numPr>
+          <w:ilvl w:val="0"/>
+          <w:numId w:val="2"/>
+        </w:numPr>
+        <w:pBdr>
+          <w:top w:val="nil"/>
+          <w:left w:val="nil"/>
+          <w:bottom w:val="nil"/>
+          <w:right w:val="nil"/>
+          <w:between w:val="nil"/>
+        </w:pBdr>
+        <w:spacing w:after="0" w:line="240" w:lineRule="auto"/>
+        <w:rPr>
+          <w:rFonts w:ascii="Garamond" w:eastAsia="Garamond" w:hAnsi="Garamond" w:cs="Garamond"/>
+          <w:color w:val="000000"/>
+          <w:sz w:val="23"/>
+          <w:szCs w:val="23"/>
+        </w:rPr>
+      </w:pPr>
+      <w:r>
+        <w:rPr>
+          <w:rFonts w:ascii="Garamond" w:eastAsia="Garamond" w:hAnsi="Garamond" w:cs="Garamond"/>
+          <w:color w:val="000000"/>
+          <w:sz w:val="23"/>
+          <w:szCs w:val="23"/>
+        </w:rPr>
+        <w:t xml:space="preserve">Production arbitrage daemon covering 10 bookmakers across 6 sports.</w:t>
+      </w:r>
+    </w:p>
+    <w:p>
+      <w:pPr>
+        <w:numPr>
+          <w:ilvl w:val="0"/>
+          <w:numId w:val="2"/>
+        </w:numPr>
+        <w:pBdr>
+          <w:top w:val="nil"/>
+          <w:left w:val="nil"/>
+          <w:bottom w:val="nil"/>
+          <w:right w:val="nil"/>
+          <w:between w:val="nil"/>
+        </w:pBdr>
+        <w:spacing w:after="0" w:line="240" w:lineRule="auto"/>
+        <w:rPr>
+          <w:rFonts w:ascii="Garamond" w:eastAsia="Garamond" w:hAnsi="Garamond" w:cs="Garamond"/>
+          <w:color w:val="000000"/>
+          <w:sz w:val="23"/>
+          <w:szCs w:val="23"/>
+        </w:rPr>
+      </w:pPr>
+      <w:r>
+        <w:rPr>
+          <w:rFonts w:ascii="Garamond" w:eastAsia="Garamond" w:hAnsi="Garamond" w:cs="Garamond"/>
+          <w:color w:val="000000"/>
+          <w:sz w:val="23"/>
+          <w:szCs w:val="23"/>
+        </w:rPr>
+        <w:t xml:space="preserve">Ingest → normalize → detect cross-book arbs → push alerts to Telegram and Discord. Runs 24/7 with replay tooling for postmortems.</w:t>
+      </w:r>
+    </w:p>
+    <w:p>
+      <w:pPr>
+        <w:numPr>
+          <w:ilvl w:val="0"/>
+          <w:numId w:val="2"/>
+        </w:numPr>
+        <w:pBdr>
+          <w:top w:val="nil"/>
+          <w:left w:val="nil"/>
+          <w:bottom w:val="nil"/>
+          <w:right w:val="nil"/>
+          <w:between w:val="nil"/>
+        </w:pBdr>
+        <w:spacing w:after="0" w:line="240" w:lineRule="auto"/>
+        <w:rPr>
+          <w:rFonts w:ascii="Garamond" w:eastAsia="Garamond" w:hAnsi="Garamond" w:cs="Garamond"/>
+          <w:color w:val="000000"/>
+          <w:sz w:val="23"/>
+          <w:szCs w:val="23"/>
+        </w:rPr>
+      </w:pPr>
+      <w:r>
+        <w:rPr>
+          <w:rFonts w:ascii="Garamond" w:eastAsia="Garamond" w:hAnsi="Garamond" w:cs="Garamond"/>
+          <w:color w:val="000000"/>
+          <w:sz w:val="23"/>
+          <w:szCs w:val="23"/>
+        </w:rPr>
+        <w:t xml:space="preserve">Built defensive ingestion: per-book health scoring, automatic backoff on bot-detection, and ten Alembic migrations from iterating on real production traffic.</w:t>
       </w:r>
     </w:p>
     <w:sectPr>
@@ -2272,103 +2411,8 @@
         <w:rFonts w:ascii="Garamond" w:eastAsia="Garamond" w:hAnsi="Garamond" w:cs="Garamond"/>
         <w:color w:val="000000"/>
       </w:rPr>
-      <w:t>3 Collinson Blvd</w:t>
+      <w:t xml:space="preserve">3 Collinson Blvd, Toronto ON M3H 3B7	14jakehoffman@gmail.com	Tel: 647-823-4504	LinkedIn	jakethehoffer.github.io/website</w:t>
     </w:r>
-    <w:r>
-      <w:rPr>
-        <w:rFonts w:ascii="Garamond" w:eastAsia="Garamond" w:hAnsi="Garamond" w:cs="Garamond"/>
-        <w:color w:val="000000"/>
-      </w:rPr>
-      <w:t>, Toronto ON M</w:t>
-    </w:r>
-    <w:r>
-      <w:rPr>
-        <w:rFonts w:ascii="Garamond" w:eastAsia="Garamond" w:hAnsi="Garamond" w:cs="Garamond"/>
-        <w:color w:val="000000"/>
-      </w:rPr>
-      <w:t>3H</w:t>
-    </w:r>
-    <w:r>
-      <w:rPr>
-        <w:rFonts w:ascii="Garamond" w:eastAsia="Garamond" w:hAnsi="Garamond" w:cs="Garamond"/>
-        <w:color w:val="000000"/>
-      </w:rPr>
-      <w:t xml:space="preserve"> </w:t>
-    </w:r>
-    <w:r>
-      <w:rPr>
-        <w:rFonts w:ascii="Garamond" w:eastAsia="Garamond" w:hAnsi="Garamond" w:cs="Garamond"/>
-        <w:color w:val="000000"/>
-      </w:rPr>
-      <w:t>3B7</w:t>
-    </w:r>
-    <w:r>
-      <w:rPr>
-        <w:rFonts w:ascii="Garamond" w:eastAsia="Garamond" w:hAnsi="Garamond" w:cs="Garamond"/>
-        <w:color w:val="000000"/>
-      </w:rPr>
-      <w:tab/>
-    </w:r>
-    <w:hyperlink r:id="rId1" w:history="1">
-      <w:r>
-        <w:rPr>
-          <w:rStyle w:val="Hyperlink"/>
-          <w:rFonts w:ascii="Garamond" w:eastAsia="Garamond" w:hAnsi="Garamond" w:cs="Garamond"/>
-        </w:rPr>
-        <w:t>14jakehoffman@gmail.com</w:t>
-      </w:r>
-    </w:hyperlink>
-    <w:r>
-      <w:rPr>
-        <w:rFonts w:ascii="Garamond" w:eastAsia="Garamond" w:hAnsi="Garamond" w:cs="Garamond"/>
-        <w:color w:val="000000"/>
-      </w:rPr>
-      <w:tab/>
-    </w:r>
-    <w:r>
-      <w:rPr>
-        <w:rFonts w:ascii="Garamond" w:eastAsia="Garamond" w:hAnsi="Garamond" w:cs="Garamond"/>
-        <w:color w:val="000000"/>
-      </w:rPr>
-      <w:t>Tel: 647-</w:t>
-    </w:r>
-    <w:r>
-      <w:rPr>
-        <w:rFonts w:ascii="Garamond" w:eastAsia="Garamond" w:hAnsi="Garamond" w:cs="Garamond"/>
-        <w:color w:val="000000"/>
-      </w:rPr>
-      <w:t>823</w:t>
-    </w:r>
-    <w:r>
-      <w:rPr>
-        <w:rFonts w:ascii="Garamond" w:eastAsia="Garamond" w:hAnsi="Garamond" w:cs="Garamond"/>
-        <w:color w:val="000000"/>
-      </w:rPr>
-      <w:t>-</w:t>
-    </w:r>
-    <w:r>
-      <w:rPr>
-        <w:rFonts w:ascii="Garamond" w:eastAsia="Garamond" w:hAnsi="Garamond" w:cs="Garamond"/>
-        <w:color w:val="000000"/>
-      </w:rPr>
-      <w:t>4504</w:t>
-    </w:r>
-    <w:r>
-      <w:rPr>
-        <w:rFonts w:ascii="Garamond" w:eastAsia="Garamond" w:hAnsi="Garamond" w:cs="Garamond"/>
-        <w:color w:val="000000"/>
-      </w:rPr>
-      <w:tab/>
-    </w:r>
-    <w:hyperlink r:id="rId2" w:history="1">
-      <w:r>
-        <w:rPr>
-          <w:rStyle w:val="Hyperlink"/>
-          <w:rFonts w:ascii="Garamond" w:eastAsia="Garamond" w:hAnsi="Garamond" w:cs="Garamond"/>
-        </w:rPr>
-        <w:t>LinkedIn</w:t>
-      </w:r>
-    </w:hyperlink>
   </w:p>
   <w:p>
     <w:pPr>

</xml_diff>

<commit_message>
feat: hyperlinks in resume contact + trim Lynx bullets (still 2 pages)
scripts/refresh-resume.py now:
- Rebuilds the contact paragraph with three <w:hyperlink> elements
  (email -> mailto:, 'LinkedIn' -> linkedin.com/in/jake-hoffman-..., and
  'jakethehoffer.github.io/website' -> https://jakethehoffer.github.io/website/),
  via header.part.relate_to(...) so the rels file gets the matching
  <Relationship> entries.
- Hyperlinks use the built-in 'Hyperlink' character style + inherit
  font/size from the original first run for visual consistency.
- Trims Lynx Equity from 5 bullets to 3 (drops 'Monday.com form
  prefills' and 'DNS lookups').
- Remains idempotent: re-runs detect 3 hyperlinks already in place
  and the trimmed bullets already gone, log [same] for both.

PDF page count: still 2. Lynx trim freed ~3 lines; PERSONAL PROJECTS
section needs ~14 lines. Page 1 now ends mid-trader-entry.

Reported as a known limitation for follow-up content-trim decision.
</commit_message>
<xml_diff>
--- a/resume-source.docx
+++ b/resume-source.docx
@@ -1067,69 +1067,7 @@
           <w:sz w:val="23"/>
           <w:szCs w:val="23"/>
         </w:rPr>
-        <w:t>Designed Monday.com form that prefills user data via URL parameters, reducing setup time for new processes.</w:t>
-      </w:r>
-    </w:p>
-    <w:p>
-      <w:pPr>
-        <w:numPr>
-          <w:ilvl w:val="0"/>
-          <w:numId w:val="2"/>
-        </w:numPr>
-        <w:pBdr>
-          <w:top w:val="nil"/>
-          <w:left w:val="nil"/>
-          <w:bottom w:val="nil"/>
-          <w:right w:val="nil"/>
-          <w:between w:val="nil"/>
-        </w:pBdr>
-        <w:spacing w:after="0" w:line="240" w:lineRule="auto"/>
-        <w:rPr>
-          <w:rFonts w:ascii="Garamond" w:eastAsia="Garamond" w:hAnsi="Garamond" w:cs="Garamond"/>
-          <w:color w:val="000000"/>
-          <w:sz w:val="23"/>
-          <w:szCs w:val="23"/>
-        </w:rPr>
-      </w:pPr>
-      <w:r>
-        <w:rPr>
-          <w:rFonts w:ascii="Garamond" w:eastAsia="Garamond" w:hAnsi="Garamond" w:cs="Garamond"/>
-          <w:color w:val="000000"/>
-          <w:sz w:val="23"/>
-          <w:szCs w:val="23"/>
-        </w:rPr>
         <w:t>Developed Google Apps Script solutions in JavaScript that select and import data from multiple Excel exports into a single Google Sheet, apply pricing logic, and track unmatched keys for reconciliation. Added a Sheets custom menu and routines to handle large datasets, plus logic to dynamically accept changing Excel file IDs.</w:t>
-      </w:r>
-    </w:p>
-    <w:p>
-      <w:pPr>
-        <w:numPr>
-          <w:ilvl w:val="0"/>
-          <w:numId w:val="2"/>
-        </w:numPr>
-        <w:pBdr>
-          <w:top w:val="nil"/>
-          <w:left w:val="nil"/>
-          <w:bottom w:val="nil"/>
-          <w:right w:val="nil"/>
-          <w:between w:val="nil"/>
-        </w:pBdr>
-        <w:spacing w:after="0" w:line="240" w:lineRule="auto"/>
-        <w:rPr>
-          <w:rFonts w:ascii="Garamond" w:eastAsia="Garamond" w:hAnsi="Garamond" w:cs="Garamond"/>
-          <w:color w:val="000000"/>
-          <w:sz w:val="23"/>
-          <w:szCs w:val="23"/>
-        </w:rPr>
-      </w:pPr>
-      <w:r>
-        <w:rPr>
-          <w:rFonts w:ascii="Garamond" w:eastAsia="Garamond" w:hAnsi="Garamond" w:cs="Garamond"/>
-          <w:color w:val="000000"/>
-          <w:sz w:val="23"/>
-          <w:szCs w:val="23"/>
-        </w:rPr>
-        <w:t xml:space="preserve">Conducted DNS lookups to gather information on subsidiary company websites, including email providers, SSL status, and other domain-related data.  </w:t>
       </w:r>
     </w:p>
     <w:p>
@@ -2411,8 +2349,70 @@
         <w:rFonts w:ascii="Garamond" w:eastAsia="Garamond" w:hAnsi="Garamond" w:cs="Garamond"/>
         <w:color w:val="000000"/>
       </w:rPr>
-      <w:t xml:space="preserve">3 Collinson Blvd, Toronto ON M3H 3B7	14jakehoffman@gmail.com	Tel: 647-823-4504	LinkedIn	jakethehoffer.github.io/website</w:t>
+      <w:t xml:space="preserve">3 Collinson Blvd, Toronto ON M3H 3B7</w:t>
     </w:r>
+    <w:r>
+      <w:rPr>
+        <w:rFonts w:ascii="Garamond" w:eastAsia="Garamond" w:hAnsi="Garamond" w:cs="Garamond"/>
+        <w:color w:val="000000"/>
+      </w:rPr>
+      <w:tab/>
+    </w:r>
+    <w:hyperlink r:id="rId1" w:history="1">
+      <w:r>
+        <w:rPr>
+          <w:rStyle w:val="Hyperlink"/>
+          <w:rFonts w:ascii="Garamond" w:eastAsia="Garamond" w:hAnsi="Garamond" w:cs="Garamond"/>
+        </w:rPr>
+        <w:t xml:space="preserve">14jakehoffman@gmail.com</w:t>
+      </w:r>
+    </w:hyperlink>
+    <w:r>
+      <w:rPr>
+        <w:rFonts w:ascii="Garamond" w:eastAsia="Garamond" w:hAnsi="Garamond" w:cs="Garamond"/>
+        <w:color w:val="000000"/>
+      </w:rPr>
+      <w:tab/>
+    </w:r>
+    <w:r>
+      <w:rPr>
+        <w:rFonts w:ascii="Garamond" w:eastAsia="Garamond" w:hAnsi="Garamond" w:cs="Garamond"/>
+        <w:color w:val="000000"/>
+      </w:rPr>
+      <w:t xml:space="preserve">Tel: 647-823-4504</w:t>
+    </w:r>
+    <w:r>
+      <w:rPr>
+        <w:rFonts w:ascii="Garamond" w:eastAsia="Garamond" w:hAnsi="Garamond" w:cs="Garamond"/>
+        <w:color w:val="000000"/>
+      </w:rPr>
+      <w:tab/>
+    </w:r>
+    <w:hyperlink r:id="rId3" w:history="1">
+      <w:r>
+        <w:rPr>
+          <w:rStyle w:val="Hyperlink"/>
+          <w:rFonts w:ascii="Garamond" w:eastAsia="Garamond" w:hAnsi="Garamond" w:cs="Garamond"/>
+        </w:rPr>
+        <w:t xml:space="preserve">LinkedIn</w:t>
+      </w:r>
+    </w:hyperlink>
+    <w:r>
+      <w:rPr>
+        <w:rFonts w:ascii="Garamond" w:eastAsia="Garamond" w:hAnsi="Garamond" w:cs="Garamond"/>
+        <w:color w:val="000000"/>
+      </w:rPr>
+      <w:tab/>
+    </w:r>
+    <w:hyperlink r:id="rId4" w:history="1">
+      <w:r>
+        <w:rPr>
+          <w:rStyle w:val="Hyperlink"/>
+          <w:rFonts w:ascii="Garamond" w:eastAsia="Garamond" w:hAnsi="Garamond" w:cs="Garamond"/>
+        </w:rPr>
+        <w:t xml:space="preserve">jakethehoffer.github.io/website</w:t>
+      </w:r>
+    </w:hyperlink>
   </w:p>
   <w:p>
     <w:pPr>

</xml_diff>

<commit_message>
feat: 1-page resume — shorten address, drop BMC, tighten PERSONAL PROJECTS
User chose option B + A from the v2.10 wrap-up plus an additional
PERSONAL-PROJECTS trim to actually hit 1 page.

Changes vs v2.10:
- Contact: '3 Collinson Blvd, Toronto ON M3H 3B7' -> 'Toronto, ON'
  (privacy win + saves the wrap-to-second-line)
- BMC Pharmacy entry: dropped entirely (4 paragraphs: role, org,
  2 bullets) — pre-Queen's, least aligned with target audience
- PERSONAL PROJECTS: dropped the italic subtitles and the most-
  arcane bullet from each project. trader and Odds Aggregator now
  have 2 bullets each instead of 3.

Result: 107 KB single-page PDF with all three hyperlinks intact.
scripts/refresh-resume.py remains idempotent — second run reports
[same] for everything.
</commit_message>
<xml_diff>
--- a/resume-source.docx
+++ b/resume-source.docx
@@ -1673,129 +1673,6 @@
     </w:p>
     <w:p>
       <w:pPr>
-        <w:spacing w:after="0"/>
-        <w:rPr>
-          <w:rFonts w:ascii="Garamond" w:eastAsia="Garamond" w:hAnsi="Garamond" w:cs="Garamond"/>
-          <w:i/>
-        </w:rPr>
-      </w:pPr>
-      <w:r>
-        <w:rPr>
-          <w:rFonts w:ascii="Garamond" w:eastAsia="Garamond" w:hAnsi="Garamond" w:cs="Garamond"/>
-          <w:b/>
-          <w:bCs/>
-          <w:iCs/>
-        </w:rPr>
-        <w:t>Financial Analyst</w:t>
-      </w:r>
-      <w:r>
-        <w:rPr>
-          <w:rFonts w:ascii="Garamond" w:eastAsia="Garamond" w:hAnsi="Garamond" w:cs="Garamond"/>
-          <w:color w:val="000000"/>
-        </w:rPr>
-        <w:t xml:space="preserve"> </w:t>
-      </w:r>
-      <w:r>
-        <w:rPr>
-          <w:rFonts w:ascii="Garamond" w:eastAsia="Garamond" w:hAnsi="Garamond" w:cs="Garamond"/>
-          <w:color w:val="000000"/>
-        </w:rPr>
-        <w:tab/>
-      </w:r>
-      <w:r>
-        <w:rPr>
-          <w:rFonts w:ascii="Garamond" w:eastAsia="Garamond" w:hAnsi="Garamond" w:cs="Garamond"/>
-          <w:color w:val="000000"/>
-        </w:rPr>
-        <w:tab/>
-      </w:r>
-      <w:r>
-        <w:rPr>
-          <w:rFonts w:ascii="Garamond" w:eastAsia="Garamond" w:hAnsi="Garamond" w:cs="Garamond"/>
-          <w:color w:val="000000"/>
-        </w:rPr>
-        <w:tab/>
-      </w:r>
-      <w:r>
-        <w:rPr>
-          <w:rFonts w:ascii="Garamond" w:eastAsia="Garamond" w:hAnsi="Garamond" w:cs="Garamond"/>
-          <w:color w:val="000000"/>
-        </w:rPr>
-        <w:tab/>
-      </w:r>
-      <w:r>
-        <w:rPr>
-          <w:rFonts w:ascii="Garamond" w:eastAsia="Garamond" w:hAnsi="Garamond" w:cs="Garamond"/>
-          <w:color w:val="000000"/>
-        </w:rPr>
-        <w:tab/>
-      </w:r>
-      <w:r>
-        <w:rPr>
-          <w:rFonts w:ascii="Garamond" w:eastAsia="Garamond" w:hAnsi="Garamond" w:cs="Garamond"/>
-          <w:color w:val="000000"/>
-        </w:rPr>
-        <w:tab/>
-      </w:r>
-      <w:r>
-        <w:rPr>
-          <w:rFonts w:ascii="Garamond" w:eastAsia="Garamond" w:hAnsi="Garamond" w:cs="Garamond"/>
-          <w:color w:val="000000"/>
-        </w:rPr>
-        <w:tab/>
-      </w:r>
-      <w:r>
-        <w:rPr>
-          <w:rFonts w:ascii="Garamond" w:eastAsia="Garamond" w:hAnsi="Garamond" w:cs="Garamond"/>
-          <w:color w:val="000000"/>
-        </w:rPr>
-        <w:tab/>
-      </w:r>
-      <w:r>
-        <w:rPr>
-          <w:rFonts w:ascii="Garamond" w:eastAsia="Garamond" w:hAnsi="Garamond" w:cs="Garamond"/>
-          <w:color w:val="000000"/>
-        </w:rPr>
-        <w:t xml:space="preserve">   </w:t>
-      </w:r>
-      <w:r>
-        <w:rPr>
-          <w:rFonts w:ascii="Garamond" w:eastAsia="Garamond" w:hAnsi="Garamond" w:cs="Garamond"/>
-          <w:color w:val="000000"/>
-        </w:rPr>
-        <w:t xml:space="preserve">          October</w:t>
-      </w:r>
-      <w:r>
-        <w:rPr>
-          <w:rFonts w:ascii="Garamond" w:eastAsia="Garamond" w:hAnsi="Garamond" w:cs="Garamond"/>
-          <w:color w:val="000000"/>
-        </w:rPr>
-        <w:t xml:space="preserve"> 2021 – </w:t>
-      </w:r>
-      <w:r>
-        <w:rPr>
-          <w:rFonts w:ascii="Garamond" w:eastAsia="Garamond" w:hAnsi="Garamond" w:cs="Garamond"/>
-          <w:color w:val="000000"/>
-        </w:rPr>
-        <w:t>June</w:t>
-      </w:r>
-      <w:r>
-        <w:rPr>
-          <w:rFonts w:ascii="Garamond" w:eastAsia="Garamond" w:hAnsi="Garamond" w:cs="Garamond"/>
-          <w:color w:val="000000"/>
-        </w:rPr>
-        <w:t xml:space="preserve"> 202</w:t>
-      </w:r>
-      <w:r>
-        <w:rPr>
-          <w:rFonts w:ascii="Garamond" w:eastAsia="Garamond" w:hAnsi="Garamond" w:cs="Garamond"/>
-          <w:color w:val="000000"/>
-        </w:rPr>
-        <w:t>3</w:t>
-      </w:r>
-    </w:p>
-    <w:p>
-      <w:pPr>
         <w:pBdr>
           <w:top w:val="nil"/>
           <w:left w:val="nil"/>
@@ -1804,44 +1681,44 @@
           <w:between w:val="nil"/>
         </w:pBdr>
         <w:spacing w:after="0" w:line="240" w:lineRule="auto"/>
-        <w:rPr>
-          <w:rFonts w:ascii="Garamond" w:eastAsia="Garamond" w:hAnsi="Garamond" w:cs="Garamond"/>
-          <w:bCs/>
-          <w:i/>
-          <w:iCs/>
-          <w:color w:val="000000"/>
-        </w:rPr>
-      </w:pPr>
-      <w:r>
-        <w:rPr>
-          <w:rFonts w:ascii="Garamond" w:eastAsia="Garamond" w:hAnsi="Garamond" w:cs="Garamond"/>
-          <w:bCs/>
-          <w:i/>
-          <w:iCs/>
-          <w:color w:val="000000"/>
-        </w:rPr>
-        <w:t>BMC Pharmacy</w:t>
-      </w:r>
-      <w:r>
-        <w:rPr>
-          <w:rFonts w:ascii="Garamond" w:eastAsia="Garamond" w:hAnsi="Garamond" w:cs="Garamond"/>
-          <w:bCs/>
-          <w:i/>
-          <w:iCs/>
-          <w:color w:val="000000"/>
-        </w:rPr>
-        <w:tab/>
-      </w:r>
-      <w:r>
-        <w:rPr>
-          <w:rFonts w:ascii="Garamond" w:eastAsia="Garamond" w:hAnsi="Garamond" w:cs="Garamond"/>
-          <w:bCs/>
-          <w:i/>
-          <w:iCs/>
-          <w:color w:val="000000"/>
-        </w:rPr>
-        <w:tab/>
-        <w:t xml:space="preserve">                                      </w:t>
+        <w:jc w:val="center"/>
+        <w:rPr>
+          <w:rFonts w:ascii="Garamond" w:eastAsia="Garamond" w:hAnsi="Garamond" w:cs="Garamond"/>
+          <w:b/>
+          <w:color w:val="000000"/>
+        </w:rPr>
+      </w:pPr>
+      <w:r>
+        <w:rPr>
+          <w:rFonts w:ascii="Garamond" w:eastAsia="Garamond" w:hAnsi="Garamond" w:cs="Garamond"/>
+          <w:b/>
+          <w:color w:val="000000"/>
+        </w:rPr>
+        <w:t xml:space="preserve">PERSONAL PROJECTS</w:t>
+      </w:r>
+    </w:p>
+    <w:p>
+      <w:pPr>
+        <w:pBdr>
+          <w:top w:val="nil"/>
+          <w:left w:val="nil"/>
+          <w:bottom w:val="nil"/>
+          <w:right w:val="nil"/>
+          <w:between w:val="nil"/>
+        </w:pBdr>
+        <w:spacing w:after="0" w:line="240" w:lineRule="auto"/>
+        <w:rPr>
+          <w:rFonts w:ascii="Garamond" w:eastAsia="Garamond" w:hAnsi="Garamond" w:cs="Garamond"/>
+          <w:color w:val="000000"/>
+        </w:rPr>
+      </w:pPr>
+      <w:r>
+        <w:rPr>
+          <w:rFonts w:ascii="Garamond" w:eastAsia="Garamond" w:hAnsi="Garamond" w:cs="Garamond"/>
+          <w:b/>
+          <w:color w:val="000000"/>
+        </w:rPr>
+        <w:t xml:space="preserve">trader (Python · IBKR · Finnhub · pytest)</w:t>
       </w:r>
     </w:p>
     <w:p>
@@ -1872,7 +1749,7 @@
           <w:sz w:val="23"/>
           <w:szCs w:val="23"/>
         </w:rPr>
-        <w:t xml:space="preserve">Conducted research in SW Ontario to scope animal drug compounding market opportunities.  </w:t>
+        <w:t xml:space="preserve">24/7 AI swing-trading agent for S&amp;P 500 equities, driven by six scheduled Claude Code routines.</w:t>
       </w:r>
     </w:p>
     <w:p>
@@ -1903,16 +1780,7 @@
           <w:sz w:val="23"/>
           <w:szCs w:val="23"/>
         </w:rPr>
-        <w:t>Tracked profitability and margin contribution for monthly/quarterly and year-over-year comparisons from drug utilization, expanded services, and other RX reports.</w:t>
-      </w:r>
-      <w:r>
-        <w:rPr>
-          <w:rFonts w:ascii="Garamond" w:eastAsia="Garamond" w:hAnsi="Garamond" w:cs="Garamond"/>
-          <w:color w:val="000000"/>
-          <w:sz w:val="23"/>
-          <w:szCs w:val="23"/>
-        </w:rPr>
-        <w:t xml:space="preserve"> </w:t>
+        <w:t xml:space="preserve">Paper-traded against SPY with kill-switch, risk gates, and committed JSON journaling; graduates to live trading after 30 days of documented outperformance.</w:t>
       </w:r>
     </w:p>
     <w:p>
@@ -1925,60 +1793,18 @@
           <w:between w:val="nil"/>
         </w:pBdr>
         <w:spacing w:after="0" w:line="240" w:lineRule="auto"/>
-        <w:jc w:val="center"/>
+        <w:rPr>
+          <w:rFonts w:ascii="Garamond" w:eastAsia="Garamond" w:hAnsi="Garamond" w:cs="Garamond"/>
+          <w:color w:val="000000"/>
+        </w:rPr>
+      </w:pPr>
+      <w:r>
         <w:rPr>
           <w:rFonts w:ascii="Garamond" w:eastAsia="Garamond" w:hAnsi="Garamond" w:cs="Garamond"/>
           <w:b/>
           <w:color w:val="000000"/>
         </w:rPr>
-      </w:pPr>
-      <w:r>
-        <w:rPr>
-          <w:rFonts w:ascii="Garamond" w:eastAsia="Garamond" w:hAnsi="Garamond" w:cs="Garamond"/>
-          <w:b/>
-          <w:color w:val="000000"/>
-        </w:rPr>
-        <w:t xml:space="preserve">PERSONAL PROJECTS</w:t>
-      </w:r>
-    </w:p>
-    <w:p>
-      <w:pPr>
-        <w:pBdr>
-          <w:top w:val="nil"/>
-          <w:left w:val="nil"/>
-          <w:bottom w:val="nil"/>
-          <w:right w:val="nil"/>
-          <w:between w:val="nil"/>
-        </w:pBdr>
-        <w:spacing w:after="0" w:line="240" w:lineRule="auto"/>
-        <w:rPr>
-          <w:rFonts w:ascii="Garamond" w:eastAsia="Garamond" w:hAnsi="Garamond" w:cs="Garamond"/>
-          <w:color w:val="000000"/>
-        </w:rPr>
-      </w:pPr>
-      <w:r>
-        <w:rPr>
-          <w:rFonts w:ascii="Garamond" w:eastAsia="Garamond" w:hAnsi="Garamond" w:cs="Garamond"/>
-          <w:b/>
-          <w:color w:val="000000"/>
-        </w:rPr>
-        <w:t xml:space="preserve">trader (Python · IBKR · Finnhub · pytest)</w:t>
-      </w:r>
-    </w:p>
-    <w:p>
-      <w:pPr>
-        <w:spacing w:after="0"/>
-        <w:rPr>
-          <w:rFonts w:ascii="Garamond" w:eastAsia="Garamond" w:hAnsi="Garamond" w:cs="Garamond"/>
-          <w:i/>
-        </w:rPr>
-      </w:pPr>
-      <w:r>
-        <w:rPr>
-          <w:rFonts w:ascii="Garamond" w:eastAsia="Garamond" w:hAnsi="Garamond" w:cs="Garamond"/>
-          <w:i/>
-        </w:rPr>
-        <w:t xml:space="preserve">AI swing-trading agent</w:t>
+        <w:t xml:space="preserve">Odds Aggregator (Python · Playwright · SQLite/Alembic · FastAPI)</w:t>
       </w:r>
     </w:p>
     <w:p>
@@ -2009,7 +1835,7 @@
           <w:sz w:val="23"/>
           <w:szCs w:val="23"/>
         </w:rPr>
-        <w:t xml:space="preserve">24/7 AI swing-trading agent for S&amp;P 500 equities, driven by six scheduled Claude Code routines.</w:t>
+        <w:t xml:space="preserve">Production arbitrage daemon covering 10 bookmakers across 6 sports.</w:t>
       </w:r>
     </w:p>
     <w:p>
@@ -2040,171 +1866,7 @@
           <w:sz w:val="23"/>
           <w:szCs w:val="23"/>
         </w:rPr>
-        <w:t xml:space="preserve">Paper-traded against SPY with kill-switch, risk gates, and committed JSON journaling; graduates to live trading after 30 days of documented outperformance.</w:t>
-      </w:r>
-    </w:p>
-    <w:p>
-      <w:pPr>
-        <w:numPr>
-          <w:ilvl w:val="0"/>
-          <w:numId w:val="2"/>
-        </w:numPr>
-        <w:pBdr>
-          <w:top w:val="nil"/>
-          <w:left w:val="nil"/>
-          <w:bottom w:val="nil"/>
-          <w:right w:val="nil"/>
-          <w:between w:val="nil"/>
-        </w:pBdr>
-        <w:spacing w:after="0" w:line="240" w:lineRule="auto"/>
-        <w:rPr>
-          <w:rFonts w:ascii="Garamond" w:eastAsia="Garamond" w:hAnsi="Garamond" w:cs="Garamond"/>
-          <w:color w:val="000000"/>
-          <w:sz w:val="23"/>
-          <w:szCs w:val="23"/>
-        </w:rPr>
-      </w:pPr>
-      <w:r>
-        <w:rPr>
-          <w:rFonts w:ascii="Garamond" w:eastAsia="Garamond" w:hAnsi="Garamond" w:cs="Garamond"/>
-          <w:color w:val="000000"/>
-          <w:sz w:val="23"/>
-          <w:szCs w:val="23"/>
-        </w:rPr>
-        <w:t xml:space="preserve">Designed broker abstraction so the live cutover is a one-line config change (IBKR active, Alpaca preserved).</w:t>
-      </w:r>
-    </w:p>
-    <w:p>
-      <w:pPr>
-        <w:pBdr>
-          <w:top w:val="nil"/>
-          <w:left w:val="nil"/>
-          <w:bottom w:val="nil"/>
-          <w:right w:val="nil"/>
-          <w:between w:val="nil"/>
-        </w:pBdr>
-        <w:spacing w:after="0" w:line="240" w:lineRule="auto"/>
-        <w:rPr>
-          <w:rFonts w:ascii="Garamond" w:eastAsia="Garamond" w:hAnsi="Garamond" w:cs="Garamond"/>
-          <w:color w:val="000000"/>
-        </w:rPr>
-      </w:pPr>
-      <w:r>
-        <w:rPr>
-          <w:rFonts w:ascii="Garamond" w:eastAsia="Garamond" w:hAnsi="Garamond" w:cs="Garamond"/>
-          <w:b/>
-          <w:color w:val="000000"/>
-        </w:rPr>
-        <w:t xml:space="preserve">Odds Aggregator (Python · Playwright · SQLite/Alembic · FastAPI)</w:t>
-      </w:r>
-    </w:p>
-    <w:p>
-      <w:pPr>
-        <w:spacing w:after="0"/>
-        <w:rPr>
-          <w:rFonts w:ascii="Garamond" w:eastAsia="Garamond" w:hAnsi="Garamond" w:cs="Garamond"/>
-          <w:i/>
-        </w:rPr>
-      </w:pPr>
-      <w:r>
-        <w:rPr>
-          <w:rFonts w:ascii="Garamond" w:eastAsia="Garamond" w:hAnsi="Garamond" w:cs="Garamond"/>
-          <w:i/>
-        </w:rPr>
-        <w:t xml:space="preserve">Production cross-book arbitrage daemon</w:t>
-      </w:r>
-    </w:p>
-    <w:p>
-      <w:pPr>
-        <w:numPr>
-          <w:ilvl w:val="0"/>
-          <w:numId w:val="2"/>
-        </w:numPr>
-        <w:pBdr>
-          <w:top w:val="nil"/>
-          <w:left w:val="nil"/>
-          <w:bottom w:val="nil"/>
-          <w:right w:val="nil"/>
-          <w:between w:val="nil"/>
-        </w:pBdr>
-        <w:spacing w:after="0" w:line="240" w:lineRule="auto"/>
-        <w:rPr>
-          <w:rFonts w:ascii="Garamond" w:eastAsia="Garamond" w:hAnsi="Garamond" w:cs="Garamond"/>
-          <w:color w:val="000000"/>
-          <w:sz w:val="23"/>
-          <w:szCs w:val="23"/>
-        </w:rPr>
-      </w:pPr>
-      <w:r>
-        <w:rPr>
-          <w:rFonts w:ascii="Garamond" w:eastAsia="Garamond" w:hAnsi="Garamond" w:cs="Garamond"/>
-          <w:color w:val="000000"/>
-          <w:sz w:val="23"/>
-          <w:szCs w:val="23"/>
-        </w:rPr>
-        <w:t xml:space="preserve">Production arbitrage daemon covering 10 bookmakers across 6 sports.</w:t>
-      </w:r>
-    </w:p>
-    <w:p>
-      <w:pPr>
-        <w:numPr>
-          <w:ilvl w:val="0"/>
-          <w:numId w:val="2"/>
-        </w:numPr>
-        <w:pBdr>
-          <w:top w:val="nil"/>
-          <w:left w:val="nil"/>
-          <w:bottom w:val="nil"/>
-          <w:right w:val="nil"/>
-          <w:between w:val="nil"/>
-        </w:pBdr>
-        <w:spacing w:after="0" w:line="240" w:lineRule="auto"/>
-        <w:rPr>
-          <w:rFonts w:ascii="Garamond" w:eastAsia="Garamond" w:hAnsi="Garamond" w:cs="Garamond"/>
-          <w:color w:val="000000"/>
-          <w:sz w:val="23"/>
-          <w:szCs w:val="23"/>
-        </w:rPr>
-      </w:pPr>
-      <w:r>
-        <w:rPr>
-          <w:rFonts w:ascii="Garamond" w:eastAsia="Garamond" w:hAnsi="Garamond" w:cs="Garamond"/>
-          <w:color w:val="000000"/>
-          <w:sz w:val="23"/>
-          <w:szCs w:val="23"/>
-        </w:rPr>
         <w:t xml:space="preserve">Ingest → normalize → detect cross-book arbs → push alerts to Telegram and Discord. Runs 24/7 with replay tooling for postmortems.</w:t>
-      </w:r>
-    </w:p>
-    <w:p>
-      <w:pPr>
-        <w:numPr>
-          <w:ilvl w:val="0"/>
-          <w:numId w:val="2"/>
-        </w:numPr>
-        <w:pBdr>
-          <w:top w:val="nil"/>
-          <w:left w:val="nil"/>
-          <w:bottom w:val="nil"/>
-          <w:right w:val="nil"/>
-          <w:between w:val="nil"/>
-        </w:pBdr>
-        <w:spacing w:after="0" w:line="240" w:lineRule="auto"/>
-        <w:rPr>
-          <w:rFonts w:ascii="Garamond" w:eastAsia="Garamond" w:hAnsi="Garamond" w:cs="Garamond"/>
-          <w:color w:val="000000"/>
-          <w:sz w:val="23"/>
-          <w:szCs w:val="23"/>
-        </w:rPr>
-      </w:pPr>
-      <w:r>
-        <w:rPr>
-          <w:rFonts w:ascii="Garamond" w:eastAsia="Garamond" w:hAnsi="Garamond" w:cs="Garamond"/>
-          <w:color w:val="000000"/>
-          <w:sz w:val="23"/>
-          <w:szCs w:val="23"/>
-        </w:rPr>
-        <w:t xml:space="preserve">Built defensive ingestion: per-book health scoring, automatic backoff on bot-detection, and ten Alembic migrations from iterating on real production traffic.</w:t>
       </w:r>
     </w:p>
     <w:sectPr>
@@ -2349,7 +2011,7 @@
         <w:rFonts w:ascii="Garamond" w:eastAsia="Garamond" w:hAnsi="Garamond" w:cs="Garamond"/>
         <w:color w:val="000000"/>
       </w:rPr>
-      <w:t xml:space="preserve">3 Collinson Blvd, Toronto ON M3H 3B7</w:t>
+      <w:t xml:space="preserve">Toronto, ON</w:t>
     </w:r>
     <w:r>
       <w:rPr>

</xml_diff>